<commit_message>
font size of word
</commit_message>
<xml_diff>
--- a/flaskr/static/documents/iscore_general_template.docx
+++ b/flaskr/static/documents/iscore_general_template.docx
@@ -78,16 +78,17 @@
               <w:jc w:val="center"/>
               <w:rPr>
                 <w:rFonts w:ascii="Times New Roman" w:hAnsi="Times New Roman" w:cs="Times New Roman"/>
-                <w:sz w:val="34"/>
-                <w:szCs w:val="34"/>
+                <w:b/>
+                <w:sz w:val="32"/>
+                <w:szCs w:val="32"/>
               </w:rPr>
             </w:pPr>
             <w:r>
               <w:rPr>
                 <w:rFonts w:ascii="Times New Roman" w:hAnsi="Times New Roman" w:cs="Times New Roman"/>
                 <w:b/>
-                <w:sz w:val="34"/>
-                <w:szCs w:val="34"/>
+                <w:sz w:val="32"/>
+                <w:szCs w:val="32"/>
               </w:rPr>
               <w:t>ISCORE MODEL COLLEGE REPORT CARD</w:t>
             </w:r>
@@ -267,21 +268,7 @@
               <w:rPr>
                 <w:rFonts w:ascii="Times New Roman" w:hAnsi="Times New Roman" w:cs="Times New Roman"/>
               </w:rPr>
-              <w:t>{{</w:t>
-            </w:r>
-            <w:proofErr w:type="spellStart"/>
-            <w:r>
-              <w:rPr>
-                <w:rFonts w:ascii="Times New Roman" w:hAnsi="Times New Roman" w:cs="Times New Roman"/>
-              </w:rPr>
-              <w:t>student_class</w:t>
-            </w:r>
-            <w:proofErr w:type="spellEnd"/>
-            <w:r>
-              <w:rPr>
-                <w:rFonts w:ascii="Times New Roman" w:hAnsi="Times New Roman" w:cs="Times New Roman"/>
-              </w:rPr>
-              <w:t>}}</w:t>
+              <w:t>{{student_class}}</w:t>
             </w:r>
           </w:p>
         </w:tc>
@@ -333,14 +320,12 @@
               </w:rPr>
               <w:t>{{</w:t>
             </w:r>
-            <w:proofErr w:type="spellStart"/>
             <w:r>
               <w:rPr>
                 <w:rFonts w:ascii="Times New Roman" w:hAnsi="Times New Roman" w:cs="Times New Roman"/>
               </w:rPr>
               <w:t>student_id</w:t>
             </w:r>
-            <w:proofErr w:type="spellEnd"/>
             <w:r>
               <w:rPr>
                 <w:rFonts w:ascii="Times New Roman" w:hAnsi="Times New Roman" w:cs="Times New Roman"/>
@@ -390,21 +375,7 @@
               <w:rPr>
                 <w:rFonts w:ascii="Times New Roman" w:hAnsi="Times New Roman" w:cs="Times New Roman"/>
               </w:rPr>
-              <w:t>{{</w:t>
-            </w:r>
-            <w:proofErr w:type="spellStart"/>
-            <w:r>
-              <w:rPr>
-                <w:rFonts w:ascii="Times New Roman" w:hAnsi="Times New Roman" w:cs="Times New Roman"/>
-              </w:rPr>
-              <w:t>student_name</w:t>
-            </w:r>
-            <w:proofErr w:type="spellEnd"/>
-            <w:r>
-              <w:rPr>
-                <w:rFonts w:ascii="Times New Roman" w:hAnsi="Times New Roman" w:cs="Times New Roman"/>
-              </w:rPr>
-              <w:t>}}</w:t>
+              <w:t>{{student_name}}</w:t>
             </w:r>
           </w:p>
         </w:tc>
@@ -1031,25 +1002,7 @@
                 <w:sz w:val="18"/>
                 <w:szCs w:val="18"/>
               </w:rPr>
-              <w:t>{{</w:t>
-            </w:r>
-            <w:proofErr w:type="spellStart"/>
-            <w:r>
-              <w:rPr>
-                <w:rFonts w:ascii="Times New Roman" w:hAnsi="Times New Roman" w:cs="Times New Roman"/>
-                <w:sz w:val="18"/>
-                <w:szCs w:val="18"/>
-              </w:rPr>
-              <w:t>number_of_subject</w:t>
-            </w:r>
-            <w:proofErr w:type="spellEnd"/>
-            <w:r>
-              <w:rPr>
-                <w:rFonts w:ascii="Times New Roman" w:hAnsi="Times New Roman" w:cs="Times New Roman"/>
-                <w:sz w:val="18"/>
-                <w:szCs w:val="18"/>
-              </w:rPr>
-              <w:t>}}</w:t>
+              <w:t>{{number_of_subject}}</w:t>
             </w:r>
           </w:p>
         </w:tc>
@@ -1166,25 +1119,7 @@
                 <w:sz w:val="18"/>
                 <w:szCs w:val="18"/>
               </w:rPr>
-              <w:t>{{</w:t>
-            </w:r>
-            <w:proofErr w:type="spellStart"/>
-            <w:r>
-              <w:rPr>
-                <w:rFonts w:ascii="Times New Roman" w:hAnsi="Times New Roman" w:cs="Times New Roman"/>
-                <w:sz w:val="18"/>
-                <w:szCs w:val="18"/>
-              </w:rPr>
-              <w:t>cumulative_score</w:t>
-            </w:r>
-            <w:proofErr w:type="spellEnd"/>
-            <w:r>
-              <w:rPr>
-                <w:rFonts w:ascii="Times New Roman" w:hAnsi="Times New Roman" w:cs="Times New Roman"/>
-                <w:sz w:val="18"/>
-                <w:szCs w:val="18"/>
-              </w:rPr>
-              <w:t>}}</w:t>
+              <w:t>{{cumulative_score}}</w:t>
             </w:r>
           </w:p>
         </w:tc>
@@ -1244,25 +1179,7 @@
                 <w:sz w:val="18"/>
                 <w:szCs w:val="18"/>
               </w:rPr>
-              <w:t>{{</w:t>
-            </w:r>
-            <w:proofErr w:type="spellStart"/>
-            <w:r>
-              <w:rPr>
-                <w:rFonts w:ascii="Times New Roman" w:hAnsi="Times New Roman" w:cs="Times New Roman"/>
-                <w:sz w:val="18"/>
-                <w:szCs w:val="18"/>
-              </w:rPr>
-              <w:t>expected_total</w:t>
-            </w:r>
-            <w:proofErr w:type="spellEnd"/>
-            <w:r>
-              <w:rPr>
-                <w:rFonts w:ascii="Times New Roman" w:hAnsi="Times New Roman" w:cs="Times New Roman"/>
-                <w:sz w:val="18"/>
-                <w:szCs w:val="18"/>
-              </w:rPr>
-              <w:t>}}</w:t>
+              <w:t>{{expected_total}}</w:t>
             </w:r>
           </w:p>
         </w:tc>
@@ -1284,25 +1201,7 @@
                 <w:sz w:val="18"/>
                 <w:szCs w:val="18"/>
               </w:rPr>
-              <w:t>{{</w:t>
-            </w:r>
-            <w:proofErr w:type="spellStart"/>
-            <w:r>
-              <w:rPr>
-                <w:rFonts w:ascii="Times New Roman" w:hAnsi="Times New Roman" w:cs="Times New Roman"/>
-                <w:sz w:val="18"/>
-                <w:szCs w:val="18"/>
-              </w:rPr>
-              <w:t>date_printed</w:t>
-            </w:r>
-            <w:proofErr w:type="spellEnd"/>
-            <w:r>
-              <w:rPr>
-                <w:rFonts w:ascii="Times New Roman" w:hAnsi="Times New Roman" w:cs="Times New Roman"/>
-                <w:sz w:val="18"/>
-                <w:szCs w:val="18"/>
-              </w:rPr>
-              <w:t>}}</w:t>
+              <w:t>{{date_printed}}</w:t>
             </w:r>
           </w:p>
         </w:tc>
@@ -1408,25 +1307,7 @@
                 <w:sz w:val="18"/>
                 <w:szCs w:val="18"/>
               </w:rPr>
-              <w:t>{{</w:t>
-            </w:r>
-            <w:proofErr w:type="spellStart"/>
-            <w:r>
-              <w:rPr>
-                <w:rFonts w:ascii="Times New Roman" w:hAnsi="Times New Roman" w:cs="Times New Roman"/>
-                <w:sz w:val="18"/>
-                <w:szCs w:val="18"/>
-              </w:rPr>
-              <w:t>number_of_distinction</w:t>
-            </w:r>
-            <w:proofErr w:type="spellEnd"/>
-            <w:r>
-              <w:rPr>
-                <w:rFonts w:ascii="Times New Roman" w:hAnsi="Times New Roman" w:cs="Times New Roman"/>
-                <w:sz w:val="18"/>
-                <w:szCs w:val="18"/>
-              </w:rPr>
-              <w:t>}}</w:t>
+              <w:t>{{number_of_distinction}}</w:t>
             </w:r>
           </w:p>
         </w:tc>
@@ -1525,7 +1406,6 @@
               </w:rPr>
               <w:t>{{</w:t>
             </w:r>
-            <w:proofErr w:type="spellStart"/>
             <w:r>
               <w:rPr>
                 <w:rFonts w:ascii="Times New Roman" w:hAnsi="Times New Roman" w:cs="Times New Roman"/>
@@ -1534,7 +1414,6 @@
               </w:rPr>
               <w:t>teachers_comment</w:t>
             </w:r>
-            <w:proofErr w:type="spellEnd"/>
             <w:r>
               <w:rPr>
                 <w:rFonts w:ascii="Times New Roman" w:hAnsi="Times New Roman" w:cs="Times New Roman"/>

</xml_diff>

<commit_message>
edited document to take more entries
</commit_message>
<xml_diff>
--- a/flaskr/static/documents/iscore_general_template.docx
+++ b/flaskr/static/documents/iscore_general_template.docx
@@ -4,7 +4,6 @@
   <w:body>
     <w:p>
       <w:pPr>
-        <w:jc w:val="center"/>
         <w:rPr>
           <w:rFonts w:ascii="Times New Roman" w:hAnsi="Times New Roman" w:cs="Times New Roman"/>
         </w:rPr>
@@ -15,9 +14,17 @@
           <w:noProof/>
         </w:rPr>
         <w:drawing>
-          <wp:inline distT="0" distB="0" distL="0" distR="0" wp14:anchorId="2D55CC85" wp14:editId="38B99088">
-            <wp:extent cx="542925" cy="542925"/>
-            <wp:effectExtent l="0" t="0" r="9525" b="9525"/>
+          <wp:anchor distT="0" distB="0" distL="114300" distR="114300" simplePos="0" relativeHeight="251659264" behindDoc="1" locked="0" layoutInCell="1" allowOverlap="1" wp14:anchorId="2D55CC85" wp14:editId="534DF54B">
+            <wp:simplePos x="0" y="0"/>
+            <wp:positionH relativeFrom="column">
+              <wp:posOffset>2466975</wp:posOffset>
+            </wp:positionH>
+            <wp:positionV relativeFrom="paragraph">
+              <wp:posOffset>-457200</wp:posOffset>
+            </wp:positionV>
+            <wp:extent cx="723900" cy="723900"/>
+            <wp:effectExtent l="0" t="0" r="0" b="0"/>
+            <wp:wrapNone/>
             <wp:docPr id="1280362602" name="Picture 1"/>
             <wp:cNvGraphicFramePr>
               <a:graphicFrameLocks xmlns:a="http://schemas.openxmlformats.org/drawingml/2006/main" noChangeAspect="1"/>
@@ -38,7 +45,7 @@
                   <pic:spPr>
                     <a:xfrm>
                       <a:off x="0" y="0"/>
-                      <a:ext cx="542925" cy="542925"/>
+                      <a:ext cx="723900" cy="723900"/>
                     </a:xfrm>
                     <a:prstGeom prst="rect">
                       <a:avLst/>
@@ -47,24 +54,33 @@
                 </pic:pic>
               </a:graphicData>
             </a:graphic>
-          </wp:inline>
+            <wp14:sizeRelH relativeFrom="page">
+              <wp14:pctWidth>0</wp14:pctWidth>
+            </wp14:sizeRelH>
+            <wp14:sizeRelV relativeFrom="page">
+              <wp14:pctHeight>0</wp14:pctHeight>
+            </wp14:sizeRelV>
+          </wp:anchor>
         </w:drawing>
       </w:r>
     </w:p>
     <w:tbl>
       <w:tblPr>
         <w:tblStyle w:val="TableGrid"/>
-        <w:tblW w:w="0" w:type="auto"/>
+        <w:tblW w:w="8728" w:type="dxa"/>
         <w:tblLook w:val="04A0" w:firstRow="1" w:lastRow="0" w:firstColumn="1" w:lastColumn="0" w:noHBand="0" w:noVBand="1"/>
       </w:tblPr>
       <w:tblGrid>
-        <w:gridCol w:w="7146"/>
-        <w:gridCol w:w="1494"/>
+        <w:gridCol w:w="7220"/>
+        <w:gridCol w:w="1508"/>
       </w:tblGrid>
       <w:tr>
+        <w:trPr>
+          <w:trHeight w:val="1064"/>
+        </w:trPr>
         <w:tc>
           <w:tcPr>
-            <w:tcW w:w="7338" w:type="dxa"/>
+            <w:tcW w:w="7220" w:type="dxa"/>
             <w:tcBorders>
               <w:top w:val="nil"/>
               <w:left w:val="nil"/>
@@ -188,7 +204,7 @@
         </w:tc>
         <w:tc>
           <w:tcPr>
-            <w:tcW w:w="1518" w:type="dxa"/>
+            <w:tcW w:w="1508" w:type="dxa"/>
             <w:tcBorders>
               <w:top w:val="nil"/>
               <w:left w:val="nil"/>

</xml_diff>

<commit_message>
Fix: report card, student info
</commit_message>
<xml_diff>
--- a/flaskr/static/documents/iscore_general_template.docx
+++ b/flaskr/static/documents/iscore_general_template.docx
@@ -14,13 +14,13 @@
           <w:noProof/>
         </w:rPr>
         <w:drawing>
-          <wp:anchor distT="0" distB="0" distL="114300" distR="114300" simplePos="0" relativeHeight="251659264" behindDoc="1" locked="0" layoutInCell="1" allowOverlap="1" wp14:anchorId="2D55CC85" wp14:editId="534DF54B">
+          <wp:anchor distT="0" distB="0" distL="114300" distR="114300" simplePos="0" relativeHeight="251659264" behindDoc="1" locked="0" layoutInCell="1" allowOverlap="1" wp14:anchorId="2D55CC85" wp14:editId="73CD44AC">
             <wp:simplePos x="0" y="0"/>
             <wp:positionH relativeFrom="column">
-              <wp:posOffset>2466975</wp:posOffset>
+              <wp:posOffset>2895600</wp:posOffset>
             </wp:positionH>
             <wp:positionV relativeFrom="paragraph">
-              <wp:posOffset>-457200</wp:posOffset>
+              <wp:posOffset>-438150</wp:posOffset>
             </wp:positionV>
             <wp:extent cx="723900" cy="723900"/>
             <wp:effectExtent l="0" t="0" r="0" b="0"/>
@@ -67,20 +67,20 @@
     <w:tbl>
       <w:tblPr>
         <w:tblStyle w:val="TableGrid"/>
-        <w:tblW w:w="8728" w:type="dxa"/>
+        <w:tblW w:w="10019" w:type="dxa"/>
         <w:tblLook w:val="04A0" w:firstRow="1" w:lastRow="0" w:firstColumn="1" w:lastColumn="0" w:noHBand="0" w:noVBand="1"/>
       </w:tblPr>
       <w:tblGrid>
-        <w:gridCol w:w="7220"/>
-        <w:gridCol w:w="1508"/>
+        <w:gridCol w:w="8288"/>
+        <w:gridCol w:w="1731"/>
       </w:tblGrid>
       <w:tr>
         <w:trPr>
-          <w:trHeight w:val="1064"/>
+          <w:trHeight w:val="902"/>
         </w:trPr>
         <w:tc>
           <w:tcPr>
-            <w:tcW w:w="7220" w:type="dxa"/>
+            <w:tcW w:w="8288" w:type="dxa"/>
             <w:tcBorders>
               <w:top w:val="nil"/>
               <w:left w:val="nil"/>
@@ -95,16 +95,16 @@
               <w:rPr>
                 <w:rFonts w:ascii="Times New Roman" w:hAnsi="Times New Roman" w:cs="Times New Roman"/>
                 <w:b/>
-                <w:sz w:val="32"/>
-                <w:szCs w:val="32"/>
+                <w:sz w:val="36"/>
+                <w:szCs w:val="36"/>
               </w:rPr>
             </w:pPr>
             <w:r>
               <w:rPr>
                 <w:rFonts w:ascii="Times New Roman" w:hAnsi="Times New Roman" w:cs="Times New Roman"/>
                 <w:b/>
-                <w:sz w:val="32"/>
-                <w:szCs w:val="32"/>
+                <w:sz w:val="36"/>
+                <w:szCs w:val="36"/>
               </w:rPr>
               <w:t>ISCORE MODEL COLLEGE REPORT CARD</w:t>
             </w:r>
@@ -204,7 +204,7 @@
         </w:tc>
         <w:tc>
           <w:tcPr>
-            <w:tcW w:w="1508" w:type="dxa"/>
+            <w:tcW w:w="1731" w:type="dxa"/>
             <w:tcBorders>
               <w:top w:val="nil"/>
               <w:left w:val="nil"/>
@@ -256,17 +256,17 @@
         <w:tblLook w:val="04A0" w:firstRow="1" w:lastRow="0" w:firstColumn="1" w:lastColumn="0" w:noHBand="0" w:noVBand="1"/>
       </w:tblPr>
       <w:tblGrid>
-        <w:gridCol w:w="3371"/>
-        <w:gridCol w:w="1685"/>
-        <w:gridCol w:w="1725"/>
+        <w:gridCol w:w="3556"/>
+        <w:gridCol w:w="1777"/>
+        <w:gridCol w:w="3031"/>
       </w:tblGrid>
       <w:tr>
         <w:trPr>
-          <w:trHeight w:val="290"/>
+          <w:trHeight w:val="265"/>
         </w:trPr>
         <w:tc>
           <w:tcPr>
-            <w:tcW w:w="3371" w:type="dxa"/>
+            <w:tcW w:w="3556" w:type="dxa"/>
           </w:tcPr>
           <w:p>
             <w:pPr>
@@ -304,7 +304,7 @@
         </w:tc>
         <w:tc>
           <w:tcPr>
-            <w:tcW w:w="1685" w:type="dxa"/>
+            <w:tcW w:w="1777" w:type="dxa"/>
           </w:tcPr>
           <w:p>
             <w:pPr>
@@ -331,7 +331,7 @@
         </w:tc>
         <w:tc>
           <w:tcPr>
-            <w:tcW w:w="1724" w:type="dxa"/>
+            <w:tcW w:w="3031" w:type="dxa"/>
             <w:tcBorders>
               <w:bottom w:val="single" w:sz="4" w:space="0" w:color="auto"/>
             </w:tcBorders>
@@ -339,7 +339,6 @@
           </w:tcPr>
           <w:p>
             <w:pPr>
-              <w:jc w:val="right"/>
               <w:rPr>
                 <w:rFonts w:ascii="Times New Roman" w:hAnsi="Times New Roman" w:cs="Times New Roman"/>
               </w:rPr>
@@ -369,11 +368,11 @@
       </w:tr>
       <w:tr>
         <w:trPr>
-          <w:trHeight w:val="290"/>
+          <w:trHeight w:val="265"/>
         </w:trPr>
         <w:tc>
           <w:tcPr>
-            <w:tcW w:w="3371" w:type="dxa"/>
+            <w:tcW w:w="3556" w:type="dxa"/>
           </w:tcPr>
           <w:p>
             <w:pPr>
@@ -391,7 +390,7 @@
         </w:tc>
         <w:tc>
           <w:tcPr>
-            <w:tcW w:w="3410" w:type="dxa"/>
+            <w:tcW w:w="4808" w:type="dxa"/>
             <w:gridSpan w:val="2"/>
             <w:tcBorders>
               <w:bottom w:val="single" w:sz="4" w:space="0" w:color="auto"/>
@@ -428,11 +427,11 @@
       </w:tr>
       <w:tr>
         <w:trPr>
-          <w:trHeight w:val="290"/>
+          <w:trHeight w:val="265"/>
         </w:trPr>
         <w:tc>
           <w:tcPr>
-            <w:tcW w:w="3371" w:type="dxa"/>
+            <w:tcW w:w="3556" w:type="dxa"/>
           </w:tcPr>
           <w:p>
             <w:pPr>
@@ -450,7 +449,7 @@
         </w:tc>
         <w:tc>
           <w:tcPr>
-            <w:tcW w:w="3410" w:type="dxa"/>
+            <w:tcW w:w="4808" w:type="dxa"/>
             <w:gridSpan w:val="2"/>
             <w:tcBorders>
               <w:top w:val="single" w:sz="4" w:space="0" w:color="auto"/>
@@ -480,11 +479,11 @@
       </w:tr>
       <w:tr>
         <w:trPr>
-          <w:trHeight w:val="290"/>
+          <w:trHeight w:val="265"/>
         </w:trPr>
         <w:tc>
           <w:tcPr>
-            <w:tcW w:w="3371" w:type="dxa"/>
+            <w:tcW w:w="3556" w:type="dxa"/>
           </w:tcPr>
           <w:p>
             <w:pPr>
@@ -502,7 +501,7 @@
         </w:tc>
         <w:tc>
           <w:tcPr>
-            <w:tcW w:w="3410" w:type="dxa"/>
+            <w:tcW w:w="4808" w:type="dxa"/>
             <w:gridSpan w:val="2"/>
             <w:tcBorders>
               <w:top w:val="single" w:sz="4" w:space="0" w:color="auto"/>
@@ -520,11 +519,11 @@
       </w:tr>
       <w:tr>
         <w:trPr>
-          <w:trHeight w:val="290"/>
+          <w:trHeight w:val="265"/>
         </w:trPr>
         <w:tc>
           <w:tcPr>
-            <w:tcW w:w="3371" w:type="dxa"/>
+            <w:tcW w:w="3556" w:type="dxa"/>
           </w:tcPr>
           <w:p>
             <w:pPr>
@@ -542,7 +541,7 @@
         </w:tc>
         <w:tc>
           <w:tcPr>
-            <w:tcW w:w="3410" w:type="dxa"/>
+            <w:tcW w:w="4808" w:type="dxa"/>
             <w:gridSpan w:val="2"/>
             <w:tcBorders>
               <w:top w:val="single" w:sz="4" w:space="0" w:color="auto"/>
@@ -566,11 +565,11 @@
       </w:tr>
       <w:tr>
         <w:trPr>
-          <w:trHeight w:val="290"/>
+          <w:trHeight w:val="265"/>
         </w:trPr>
         <w:tc>
           <w:tcPr>
-            <w:tcW w:w="3371" w:type="dxa"/>
+            <w:tcW w:w="3556" w:type="dxa"/>
           </w:tcPr>
           <w:p>
             <w:pPr>
@@ -588,7 +587,7 @@
         </w:tc>
         <w:tc>
           <w:tcPr>
-            <w:tcW w:w="3410" w:type="dxa"/>
+            <w:tcW w:w="4808" w:type="dxa"/>
             <w:gridSpan w:val="2"/>
             <w:tcBorders>
               <w:top w:val="single" w:sz="4" w:space="0" w:color="auto"/>
@@ -623,17 +622,17 @@
     <w:tbl>
       <w:tblPr>
         <w:tblStyle w:val="TableGrid"/>
-        <w:tblW w:w="9351" w:type="dxa"/>
+        <w:tblW w:w="9918" w:type="dxa"/>
         <w:tblLook w:val="04A0" w:firstRow="1" w:lastRow="0" w:firstColumn="1" w:lastColumn="0" w:noHBand="0" w:noVBand="1"/>
       </w:tblPr>
       <w:tblGrid>
-        <w:gridCol w:w="581"/>
-        <w:gridCol w:w="3090"/>
-        <w:gridCol w:w="849"/>
+        <w:gridCol w:w="580"/>
+        <w:gridCol w:w="3517"/>
+        <w:gridCol w:w="850"/>
+        <w:gridCol w:w="991"/>
         <w:gridCol w:w="992"/>
-        <w:gridCol w:w="991"/>
-        <w:gridCol w:w="991"/>
-        <w:gridCol w:w="1857"/>
+        <w:gridCol w:w="992"/>
+        <w:gridCol w:w="1996"/>
       </w:tblGrid>
       <w:tr>
         <w:trPr>
@@ -641,7 +640,7 @@
         </w:trPr>
         <w:tc>
           <w:tcPr>
-            <w:tcW w:w="581" w:type="dxa"/>
+            <w:tcW w:w="580" w:type="dxa"/>
             <w:vMerge w:val="restart"/>
           </w:tcPr>
           <w:p>
@@ -668,7 +667,7 @@
         </w:tc>
         <w:tc>
           <w:tcPr>
-            <w:tcW w:w="3100" w:type="dxa"/>
+            <w:tcW w:w="3517" w:type="dxa"/>
             <w:vMerge w:val="restart"/>
           </w:tcPr>
           <w:p>
@@ -723,7 +722,7 @@
         </w:tc>
         <w:tc>
           <w:tcPr>
-            <w:tcW w:w="993" w:type="dxa"/>
+            <w:tcW w:w="991" w:type="dxa"/>
           </w:tcPr>
           <w:p>
             <w:pPr>
@@ -804,7 +803,7 @@
         </w:tc>
         <w:tc>
           <w:tcPr>
-            <w:tcW w:w="1843" w:type="dxa"/>
+            <w:tcW w:w="1996" w:type="dxa"/>
             <w:vMerge w:val="restart"/>
           </w:tcPr>
           <w:p>
@@ -836,7 +835,7 @@
         </w:trPr>
         <w:tc>
           <w:tcPr>
-            <w:tcW w:w="581" w:type="dxa"/>
+            <w:tcW w:w="580" w:type="dxa"/>
             <w:vMerge/>
           </w:tcPr>
           <w:p>
@@ -851,7 +850,7 @@
         </w:tc>
         <w:tc>
           <w:tcPr>
-            <w:tcW w:w="3100" w:type="dxa"/>
+            <w:tcW w:w="3517" w:type="dxa"/>
             <w:vMerge/>
           </w:tcPr>
           <w:p>
@@ -893,7 +892,7 @@
         </w:tc>
         <w:tc>
           <w:tcPr>
-            <w:tcW w:w="993" w:type="dxa"/>
+            <w:tcW w:w="991" w:type="dxa"/>
           </w:tcPr>
           <w:p>
             <w:pPr>
@@ -962,7 +961,7 @@
         </w:tc>
         <w:tc>
           <w:tcPr>
-            <w:tcW w:w="1843" w:type="dxa"/>
+            <w:tcW w:w="1996" w:type="dxa"/>
             <w:vMerge/>
           </w:tcPr>
           <w:p>
@@ -1004,8 +1003,8 @@
       </w:tblPr>
       <w:tblGrid>
         <w:gridCol w:w="3402"/>
-        <w:gridCol w:w="2268"/>
-        <w:gridCol w:w="2268"/>
+        <w:gridCol w:w="3402"/>
+        <w:gridCol w:w="1843"/>
       </w:tblGrid>
       <w:tr>
         <w:tc>
@@ -1032,7 +1031,7 @@
         </w:tc>
         <w:tc>
           <w:tcPr>
-            <w:tcW w:w="2268" w:type="dxa"/>
+            <w:tcW w:w="3402" w:type="dxa"/>
           </w:tcPr>
           <w:p>
             <w:pPr>
@@ -1072,7 +1071,7 @@
         </w:tc>
         <w:tc>
           <w:tcPr>
-            <w:tcW w:w="2268" w:type="dxa"/>
+            <w:tcW w:w="1843" w:type="dxa"/>
           </w:tcPr>
           <w:p>
             <w:pPr>
@@ -1090,13 +1089,13 @@
                 <w:szCs w:val="18"/>
               </w:rPr>
               <w:drawing>
-                <wp:anchor distT="0" distB="0" distL="114300" distR="114300" simplePos="0" relativeHeight="251658240" behindDoc="0" locked="0" layoutInCell="1" allowOverlap="1" wp14:anchorId="12912B40" wp14:editId="5DE8ED42">
+                <wp:anchor distT="0" distB="0" distL="114300" distR="114300" simplePos="0" relativeHeight="251658240" behindDoc="0" locked="0" layoutInCell="1" allowOverlap="1" wp14:anchorId="12912B40" wp14:editId="2569EB59">
                   <wp:simplePos x="0" y="0"/>
                   <wp:positionH relativeFrom="column">
-                    <wp:posOffset>-651480</wp:posOffset>
+                    <wp:posOffset>-689610</wp:posOffset>
                   </wp:positionH>
                   <wp:positionV relativeFrom="paragraph">
-                    <wp:posOffset>-229870</wp:posOffset>
+                    <wp:posOffset>-244475</wp:posOffset>
                   </wp:positionV>
                   <wp:extent cx="1424305" cy="1097280"/>
                   <wp:effectExtent l="0" t="0" r="0" b="0"/>
@@ -1167,7 +1166,7 @@
         </w:tc>
         <w:tc>
           <w:tcPr>
-            <w:tcW w:w="2268" w:type="dxa"/>
+            <w:tcW w:w="3402" w:type="dxa"/>
           </w:tcPr>
           <w:p>
             <w:pPr>
@@ -1207,7 +1206,7 @@
         </w:tc>
         <w:tc>
           <w:tcPr>
-            <w:tcW w:w="2268" w:type="dxa"/>
+            <w:tcW w:w="1843" w:type="dxa"/>
           </w:tcPr>
           <w:p>
             <w:pPr>
@@ -1245,7 +1244,7 @@
         </w:tc>
         <w:tc>
           <w:tcPr>
-            <w:tcW w:w="2268" w:type="dxa"/>
+            <w:tcW w:w="3402" w:type="dxa"/>
           </w:tcPr>
           <w:p>
             <w:pPr>
@@ -1285,7 +1284,7 @@
         </w:tc>
         <w:tc>
           <w:tcPr>
-            <w:tcW w:w="2268" w:type="dxa"/>
+            <w:tcW w:w="1843" w:type="dxa"/>
           </w:tcPr>
           <w:p>
             <w:pPr>
@@ -1349,7 +1348,7 @@
         </w:tc>
         <w:tc>
           <w:tcPr>
-            <w:tcW w:w="2268" w:type="dxa"/>
+            <w:tcW w:w="3402" w:type="dxa"/>
           </w:tcPr>
           <w:p>
             <w:pPr>
@@ -1381,7 +1380,7 @@
         </w:tc>
         <w:tc>
           <w:tcPr>
-            <w:tcW w:w="2268" w:type="dxa"/>
+            <w:tcW w:w="1843" w:type="dxa"/>
           </w:tcPr>
           <w:p>
             <w:pPr>
@@ -1419,7 +1418,7 @@
         </w:tc>
         <w:tc>
           <w:tcPr>
-            <w:tcW w:w="2268" w:type="dxa"/>
+            <w:tcW w:w="3402" w:type="dxa"/>
           </w:tcPr>
           <w:p>
             <w:pPr>
@@ -1459,7 +1458,7 @@
         </w:tc>
         <w:tc>
           <w:tcPr>
-            <w:tcW w:w="2268" w:type="dxa"/>
+            <w:tcW w:w="1843" w:type="dxa"/>
           </w:tcPr>
           <w:p>
             <w:pPr>
@@ -1500,12 +1499,12 @@
         <w:tblLook w:val="04A0" w:firstRow="1" w:lastRow="0" w:firstColumn="1" w:lastColumn="0" w:noHBand="0" w:noVBand="1"/>
       </w:tblPr>
       <w:tblGrid>
-        <w:gridCol w:w="8640"/>
+        <w:gridCol w:w="9923"/>
       </w:tblGrid>
       <w:tr>
         <w:tc>
           <w:tcPr>
-            <w:tcW w:w="8856" w:type="dxa"/>
+            <w:tcW w:w="9923" w:type="dxa"/>
             <w:tcBorders>
               <w:top w:val="nil"/>
               <w:left w:val="nil"/>
@@ -1576,7 +1575,7 @@
       <w:tr>
         <w:tc>
           <w:tcPr>
-            <w:tcW w:w="8856" w:type="dxa"/>
+            <w:tcW w:w="9923" w:type="dxa"/>
             <w:tcBorders>
               <w:left w:val="nil"/>
               <w:right w:val="nil"/>
@@ -1652,7 +1651,7 @@
     </w:p>
     <w:sectPr>
       <w:pgSz w:w="12240" w:h="15840"/>
-      <w:pgMar w:top="1440" w:right="1800" w:bottom="1440" w:left="1800" w:header="720" w:footer="720" w:gutter="0"/>
+      <w:pgMar w:top="1134" w:right="1134" w:bottom="567" w:left="1134" w:header="720" w:footer="720" w:gutter="0"/>
       <w:cols w:space="720"/>
       <w:docGrid w:linePitch="360"/>
     </w:sectPr>

</xml_diff>